<commit_message>
Docs: record W-02/W-04/W-05 closed, W-11 found, corrected W-08 count
Regenerated from the live tree after the Phase 0 + Phase 3 work:
  - W-02 CLOSED: tested-patch sandbox enforced (15 tests)
  - W-04 CLOSED: swarm typechecks clean, blocking CI gate
  - W-05 CLOSED: live CI gating both suites + proof gates
  - W-11 NEW: swarm install not reproducible (npm ci rejects the
    lockfile on a transitive ajv-formats conflict)
  - W-08 corrected: 48 files pending path centralization, not 22 --
    the previously documented figure predated tree growth. Re-derived
    from core.paths.migration_report(), not carried over on faith.

Roadmap: phases 0-3 done; phase 4 (distributed worker plane) is next.

Co-Authored-By: Claude Opus 5 <noreply@anthropic.com>
Claude-Session: https://claude.ai/code/session_01HbihhqCH3c2tvHn1UjsDPx
</commit_message>
<xml_diff>
--- a/mainbrain/docs/MAINBRAIN_Documentation.docx
+++ b/mainbrain/docs/MAINBRAIN_Documentation.docx
@@ -2485,7 +2485,7 @@
                 <w:sz w:val="19"/>
                 <w:szCs w:val="19"/>
               </w:rPr>
-              <w:t xml:space="preserve">Self-edit gate chain incomplete</w:t>
+              <w:t xml:space="preserve">CLOSED — tested-patch sandbox now enforced</w:t>
             </w:r>
           </w:p>
         </w:tc>
@@ -2531,7 +2531,7 @@
                 <w:sz w:val="19"/>
                 <w:szCs w:val="19"/>
               </w:rPr>
-              <w:t xml:space="preserve">Build SPEC-TESTED_PATCH_EXECUTION_SANDBOX</w:t>
+              <w:t xml:space="preserve">Done: docking/improvement/sandbox.py, 15 tests</w:t>
             </w:r>
           </w:p>
         </w:tc>
@@ -2679,7 +2679,7 @@
                 <w:sz w:val="19"/>
                 <w:szCs w:val="19"/>
               </w:rPr>
-              <w:t xml:space="preserve">OKComputer shell never built in CI</w:t>
+              <w:t xml:space="preserve">CLOSED — swarm typechecks clean in CI</w:t>
             </w:r>
           </w:p>
         </w:tc>
@@ -2725,7 +2725,7 @@
                 <w:sz w:val="19"/>
                 <w:szCs w:val="19"/>
               </w:rPr>
-              <w:t xml:space="preserve">Node CI job running verify:integration</w:t>
+              <w:t xml:space="preserve">Done: tsc --noEmit exits 0, blocking gate</w:t>
             </w:r>
           </w:p>
         </w:tc>
@@ -2776,7 +2776,7 @@
                 <w:sz w:val="19"/>
                 <w:szCs w:val="19"/>
               </w:rPr>
-              <w:t xml:space="preserve">No live CI on the fork</w:t>
+              <w:t xml:space="preserve">CLOSED — live CI gating both suites</w:t>
             </w:r>
           </w:p>
         </w:tc>
@@ -2822,7 +2822,7 @@
                 <w:sz w:val="19"/>
                 <w:szCs w:val="19"/>
               </w:rPr>
-              <w:t xml:space="preserve">mainbrain-ci.yml running both suites</w:t>
+              <w:t xml:space="preserve">Done: .github/workflows/mainbrain-ci.yml</w:t>
             </w:r>
           </w:p>
         </w:tc>
@@ -3113,7 +3113,7 @@
                 <w:sz w:val="19"/>
                 <w:szCs w:val="19"/>
               </w:rPr>
-              <w:t xml:space="preserve">Migrate 22 files to core.paths</w:t>
+              <w:t xml:space="preserve">Migrate 48 pending files to core.paths</w:t>
             </w:r>
           </w:p>
         </w:tc>
@@ -3308,6 +3308,103 @@
                 <w:szCs w:val="19"/>
               </w:rPr>
               <w:t xml:space="preserve">LanceDB + graph lineage; Postgres authoritative</w:t>
+            </w:r>
+          </w:p>
+        </w:tc>
+      </w:tr>
+      <w:tr>
+        <w:trPr>
+          <w:tblHeader w:val="false"/>
+        </w:trPr>
+        <w:tc>
+          <w:tcPr>
+            <w:tcW w:type="dxa" w:w="900"/>
+            <w:tcMar>
+              <w:top w:type="dxa" w:w="60"/>
+              <w:left w:type="dxa" w:w="100"/>
+              <w:bottom w:type="dxa" w:w="60"/>
+              <w:right w:type="dxa" w:w="100"/>
+            </w:tcMar>
+          </w:tcPr>
+          <w:p>
+            <w:r>
+              <w:rPr>
+                <w:b w:val="false"/>
+                <w:bCs w:val="false"/>
+                <w:color w:val="1B2233"/>
+                <w:sz w:val="19"/>
+                <w:szCs w:val="19"/>
+              </w:rPr>
+              <w:t xml:space="preserve">W-11</w:t>
+            </w:r>
+          </w:p>
+        </w:tc>
+        <w:tc>
+          <w:tcPr>
+            <w:tcW w:type="dxa" w:w="3900"/>
+            <w:tcMar>
+              <w:top w:type="dxa" w:w="60"/>
+              <w:left w:type="dxa" w:w="100"/>
+              <w:bottom w:type="dxa" w:w="60"/>
+              <w:right w:type="dxa" w:w="100"/>
+            </w:tcMar>
+          </w:tcPr>
+          <w:p>
+            <w:r>
+              <w:rPr>
+                <w:b w:val="false"/>
+                <w:bCs w:val="false"/>
+                <w:color w:val="1B2233"/>
+                <w:sz w:val="19"/>
+                <w:szCs w:val="19"/>
+              </w:rPr>
+              <w:t xml:space="preserve">Swarm install not reproducible</w:t>
+            </w:r>
+          </w:p>
+        </w:tc>
+        <w:tc>
+          <w:tcPr>
+            <w:tcW w:type="dxa" w:w="1500"/>
+            <w:tcMar>
+              <w:top w:type="dxa" w:w="60"/>
+              <w:left w:type="dxa" w:w="100"/>
+              <w:bottom w:type="dxa" w:w="60"/>
+              <w:right w:type="dxa" w:w="100"/>
+            </w:tcMar>
+          </w:tcPr>
+          <w:p>
+            <w:r>
+              <w:rPr>
+                <w:b w:val="false"/>
+                <w:bCs w:val="false"/>
+                <w:color w:val="1B2233"/>
+                <w:sz w:val="19"/>
+                <w:szCs w:val="19"/>
+              </w:rPr>
+              <w:t xml:space="preserve">Medium</w:t>
+            </w:r>
+          </w:p>
+        </w:tc>
+        <w:tc>
+          <w:tcPr>
+            <w:tcW w:type="dxa" w:w="4500"/>
+            <w:tcMar>
+              <w:top w:type="dxa" w:w="60"/>
+              <w:left w:type="dxa" w:w="100"/>
+              <w:bottom w:type="dxa" w:w="60"/>
+              <w:right w:type="dxa" w:w="100"/>
+            </w:tcMar>
+          </w:tcPr>
+          <w:p>
+            <w:r>
+              <w:rPr>
+                <w:b w:val="false"/>
+                <w:bCs w:val="false"/>
+                <w:color w:val="1B2233"/>
+                <w:sz w:val="19"/>
+                <w:szCs w:val="19"/>
+              </w:rPr>
+              <w:t xml:space="preserve">Pin ajv-formats via overrides; npm ci rejects the lockfile</w:t>
             </w:r>
           </w:p>
         </w:tc>
@@ -3543,7 +3640,7 @@
                 <w:sz w:val="19"/>
                 <w:szCs w:val="19"/>
               </w:rPr>
-              <w:t xml:space="preserve">Do first</w:t>
+              <w:t xml:space="preserve">Done</w:t>
             </w:r>
           </w:p>
         </w:tc>
@@ -3834,7 +3931,7 @@
                 <w:sz w:val="19"/>
                 <w:szCs w:val="19"/>
               </w:rPr>
-              <w:t xml:space="preserve">Next</w:t>
+              <w:t xml:space="preserve">Done</w:t>
             </w:r>
           </w:p>
         </w:tc>
@@ -3931,7 +4028,7 @@
                 <w:sz w:val="19"/>
                 <w:szCs w:val="19"/>
               </w:rPr>
-              <w:t xml:space="preserve">Then</w:t>
+              <w:t xml:space="preserve">Next</w:t>
             </w:r>
           </w:p>
         </w:tc>

</xml_diff>